<commit_message>
docs: fix versioning control table
add note section to describe each version
</commit_message>
<xml_diff>
--- a/docs/project-management/Acta de Inicio WineGrapp.docx
+++ b/docs/project-management/Acta de Inicio WineGrapp.docx
@@ -174,7 +174,6 @@
         </w:rPr>
         <w:br/>
       </w:r>
-      <w:proofErr w:type="spellStart"/>
       <w:r>
         <w:rPr>
           <w:b/>
@@ -205,7 +204,6 @@
         </w:rPr>
         <w:t>app</w:t>
       </w:r>
-      <w:proofErr w:type="spellEnd"/>
     </w:p>
     <w:p>
       <w:pPr>
@@ -1631,7 +1629,6 @@
                 <w:color w:val="000000"/>
               </w:rPr>
             </w:pPr>
-            <w:proofErr w:type="spellStart"/>
             <w:r>
               <w:rPr>
                 <w:color w:val="000000"/>
@@ -1644,7 +1641,6 @@
               </w:rPr>
               <w:t>’os</w:t>
             </w:r>
-            <w:proofErr w:type="spellEnd"/>
           </w:p>
         </w:tc>
       </w:tr>
@@ -1691,14 +1687,12 @@
                 <w:color w:val="000000"/>
               </w:rPr>
             </w:pPr>
-            <w:proofErr w:type="spellStart"/>
             <w:r>
               <w:rPr>
                 <w:color w:val="000000"/>
               </w:rPr>
               <w:t>Winegrapp</w:t>
             </w:r>
-            <w:proofErr w:type="spellEnd"/>
           </w:p>
         </w:tc>
       </w:tr>
@@ -1819,13 +1813,8 @@
               <w:spacing w:after="0" w:line="240" w:lineRule="auto"/>
             </w:pPr>
             <w:r>
-              <w:t xml:space="preserve">Comunidad </w:t>
-            </w:r>
-            <w:proofErr w:type="spellStart"/>
-            <w:r>
-              <w:t>Winer’s</w:t>
-            </w:r>
-            <w:proofErr w:type="spellEnd"/>
+              <w:t>Comunidad Winer’s</w:t>
+            </w:r>
           </w:p>
         </w:tc>
       </w:tr>
@@ -1888,22 +1877,22 @@
         <w:spacing w:before="280" w:after="280"/>
       </w:pPr>
       <w:bookmarkStart w:id="8" w:name="_heading=h.fjpwzbtjl3ub" w:colFirst="0" w:colLast="0"/>
-      <w:bookmarkStart w:id="9" w:name="_Toc786838536"/>
-      <w:bookmarkStart w:id="10" w:name="_Toc674983180"/>
-      <w:bookmarkStart w:id="11" w:name="_Toc734059141"/>
-      <w:bookmarkStart w:id="12" w:name="_Toc224756913"/>
+      <w:bookmarkStart w:id="9" w:name="_Toc674983180"/>
+      <w:bookmarkStart w:id="10" w:name="_Toc734059141"/>
+      <w:bookmarkStart w:id="11" w:name="_Toc224756913"/>
+      <w:bookmarkStart w:id="12" w:name="_Toc786838536"/>
       <w:bookmarkEnd w:id="8"/>
       <w:r>
         <w:lastRenderedPageBreak/>
         <w:t>Historial de Versiones</w:t>
       </w:r>
+      <w:bookmarkEnd w:id="9"/>
       <w:bookmarkEnd w:id="10"/>
       <w:bookmarkEnd w:id="11"/>
-      <w:bookmarkEnd w:id="12"/>
     </w:p>
     <w:tbl>
       <w:tblPr>
-        <w:tblW w:w="9105" w:type="dxa"/>
+        <w:tblW w:w="12390" w:type="dxa"/>
         <w:tblLayout w:type="fixed"/>
         <w:tblLook w:val="0400" w:firstRow="0" w:lastRow="0" w:firstColumn="0" w:lastColumn="0" w:noHBand="0" w:noVBand="1"/>
       </w:tblPr>
@@ -1913,8 +1902,13 @@
         <w:gridCol w:w="1965"/>
         <w:gridCol w:w="1620"/>
         <w:gridCol w:w="3285"/>
+        <w:gridCol w:w="3285"/>
       </w:tblGrid>
       <w:tr>
+        <w:trPr>
+          <w:gridAfter w:val="1"/>
+          <w:wAfter w:w="3285" w:type="dxa"/>
+        </w:trPr>
         <w:tc>
           <w:tcPr>
             <w:tcW w:w="1065" w:type="dxa"/>
@@ -2082,6 +2076,10 @@
         </w:tc>
       </w:tr>
       <w:tr>
+        <w:trPr>
+          <w:gridAfter w:val="1"/>
+          <w:wAfter w:w="3285" w:type="dxa"/>
+        </w:trPr>
         <w:tc>
           <w:tcPr>
             <w:tcW w:w="1065" w:type="dxa"/>
@@ -2244,14 +2242,12 @@
                 <w:szCs w:val="20"/>
               </w:rPr>
             </w:pPr>
-            <w:proofErr w:type="spellStart"/>
             <w:r>
               <w:rPr>
                 <w:color w:val="000000"/>
               </w:rPr>
               <w:t>ACID’os</w:t>
             </w:r>
-            <w:proofErr w:type="spellEnd"/>
           </w:p>
         </w:tc>
         <w:tc>
@@ -2289,6 +2285,8 @@
       </w:tr>
       <w:tr>
         <w:trPr>
+          <w:gridAfter w:val="1"/>
+          <w:wAfter w:w="3285" w:type="dxa"/>
           <w:trHeight w:val="300"/>
         </w:trPr>
         <w:tc>
@@ -2408,14 +2406,12 @@
                 <w:szCs w:val="20"/>
               </w:rPr>
             </w:pPr>
-            <w:proofErr w:type="spellStart"/>
             <w:r>
               <w:rPr>
                 <w:color w:val="000000"/>
               </w:rPr>
               <w:t>ACID’os</w:t>
             </w:r>
-            <w:proofErr w:type="spellEnd"/>
           </w:p>
         </w:tc>
         <w:tc>
@@ -2479,7 +2475,8 @@
         </w:trPr>
         <w:tc>
           <w:tcPr>
-            <w:tcW w:w="1065" w:type="dxa"/>
+            <w:tcW w:w="9105" w:type="dxa"/>
+            <w:gridSpan w:val="5"/>
             <w:tcBorders>
               <w:top w:val="single" w:sz="4" w:space="0" w:color="000000" w:themeColor="text1"/>
               <w:left w:val="single" w:sz="4" w:space="0" w:color="000000" w:themeColor="text1"/>
@@ -2494,72 +2491,12 @@
               <w:rPr>
                 <w:b/>
                 <w:bCs/>
+                <w:color w:val="000000" w:themeColor="text1"/>
                 <w:sz w:val="20"/>
                 <w:szCs w:val="20"/>
               </w:rPr>
             </w:pPr>
-          </w:p>
-        </w:tc>
-        <w:tc>
-          <w:tcPr>
-            <w:tcW w:w="1170" w:type="dxa"/>
-            <w:tcBorders>
-              <w:top w:val="single" w:sz="4" w:space="0" w:color="000000" w:themeColor="text1"/>
-              <w:left w:val="single" w:sz="4" w:space="0" w:color="000000" w:themeColor="text1"/>
-              <w:bottom w:val="single" w:sz="4" w:space="0" w:color="000000" w:themeColor="text1"/>
-              <w:right w:val="single" w:sz="4" w:space="0" w:color="000000" w:themeColor="text1"/>
-            </w:tcBorders>
-          </w:tcPr>
-          <w:p>
-            <w:pPr>
-              <w:spacing w:line="240" w:lineRule="auto"/>
-              <w:jc w:val="center"/>
-              <w:rPr>
-                <w:b/>
-                <w:bCs/>
-                <w:sz w:val="20"/>
-                <w:szCs w:val="20"/>
-              </w:rPr>
-            </w:pPr>
-          </w:p>
-        </w:tc>
-        <w:tc>
-          <w:tcPr>
-            <w:tcW w:w="1965" w:type="dxa"/>
-            <w:tcBorders>
-              <w:top w:val="single" w:sz="4" w:space="0" w:color="000000" w:themeColor="text1"/>
-              <w:left w:val="single" w:sz="4" w:space="0" w:color="000000" w:themeColor="text1"/>
-              <w:bottom w:val="single" w:sz="4" w:space="0" w:color="000000" w:themeColor="text1"/>
-              <w:right w:val="single" w:sz="4" w:space="0" w:color="000000" w:themeColor="text1"/>
-            </w:tcBorders>
-          </w:tcPr>
-          <w:p>
-            <w:pPr>
-              <w:spacing w:line="240" w:lineRule="auto"/>
-              <w:jc w:val="center"/>
-              <w:rPr>
-                <w:b/>
-                <w:bCs/>
-                <w:sz w:val="20"/>
-                <w:szCs w:val="20"/>
-              </w:rPr>
-            </w:pPr>
-          </w:p>
-        </w:tc>
-        <w:tc>
-          <w:tcPr>
-            <w:tcW w:w="1620" w:type="dxa"/>
-            <w:tcBorders>
-              <w:top w:val="single" w:sz="4" w:space="0" w:color="000000" w:themeColor="text1"/>
-              <w:left w:val="single" w:sz="4" w:space="0" w:color="000000" w:themeColor="text1"/>
-              <w:bottom w:val="single" w:sz="4" w:space="0" w:color="000000" w:themeColor="text1"/>
-              <w:right w:val="single" w:sz="4" w:space="0" w:color="000000" w:themeColor="text1"/>
-            </w:tcBorders>
-          </w:tcPr>
-          <w:p>
-            <w:pPr>
-              <w:spacing w:line="240" w:lineRule="auto"/>
-              <w:jc w:val="center"/>
+            <w:r>
               <w:rPr>
                 <w:b/>
                 <w:bCs/>
@@ -2567,18 +2504,13 @@
                 <w:sz w:val="20"/>
                 <w:szCs w:val="20"/>
               </w:rPr>
-            </w:pPr>
+              <w:t xml:space="preserve">Nota: Las versiones desarrollas antes de esta nota están basadas en el MVP, no gestión de usuarios, no APIs externas, no criticas basadas en roles. </w:t>
+            </w:r>
           </w:p>
         </w:tc>
         <w:tc>
           <w:tcPr>
             <w:tcW w:w="3285" w:type="dxa"/>
-            <w:tcBorders>
-              <w:top w:val="single" w:sz="4" w:space="0" w:color="000000" w:themeColor="text1"/>
-              <w:left w:val="single" w:sz="4" w:space="0" w:color="000000" w:themeColor="text1"/>
-              <w:bottom w:val="single" w:sz="4" w:space="0" w:color="000000" w:themeColor="text1"/>
-              <w:right w:val="single" w:sz="4" w:space="0" w:color="000000" w:themeColor="text1"/>
-            </w:tcBorders>
           </w:tcPr>
           <w:p>
             <w:pPr>
@@ -2595,122 +2527,6 @@
           </w:p>
         </w:tc>
       </w:tr>
-      <w:tr>
-        <w:trPr>
-          <w:trHeight w:val="300"/>
-        </w:trPr>
-        <w:tc>
-          <w:tcPr>
-            <w:tcW w:w="1065" w:type="dxa"/>
-            <w:tcBorders>
-              <w:top w:val="single" w:sz="4" w:space="0" w:color="000000" w:themeColor="text1"/>
-              <w:left w:val="single" w:sz="4" w:space="0" w:color="000000" w:themeColor="text1"/>
-              <w:bottom w:val="single" w:sz="4" w:space="0" w:color="000000" w:themeColor="text1"/>
-              <w:right w:val="single" w:sz="4" w:space="0" w:color="000000" w:themeColor="text1"/>
-            </w:tcBorders>
-          </w:tcPr>
-          <w:p>
-            <w:pPr>
-              <w:spacing w:line="240" w:lineRule="auto"/>
-              <w:jc w:val="center"/>
-              <w:rPr>
-                <w:b/>
-                <w:bCs/>
-                <w:sz w:val="20"/>
-                <w:szCs w:val="20"/>
-              </w:rPr>
-            </w:pPr>
-          </w:p>
-        </w:tc>
-        <w:tc>
-          <w:tcPr>
-            <w:tcW w:w="1170" w:type="dxa"/>
-            <w:tcBorders>
-              <w:top w:val="single" w:sz="4" w:space="0" w:color="000000" w:themeColor="text1"/>
-              <w:left w:val="single" w:sz="4" w:space="0" w:color="000000" w:themeColor="text1"/>
-              <w:bottom w:val="single" w:sz="4" w:space="0" w:color="000000" w:themeColor="text1"/>
-              <w:right w:val="single" w:sz="4" w:space="0" w:color="000000" w:themeColor="text1"/>
-            </w:tcBorders>
-          </w:tcPr>
-          <w:p>
-            <w:pPr>
-              <w:spacing w:line="240" w:lineRule="auto"/>
-              <w:jc w:val="center"/>
-              <w:rPr>
-                <w:b/>
-                <w:bCs/>
-                <w:sz w:val="20"/>
-                <w:szCs w:val="20"/>
-              </w:rPr>
-            </w:pPr>
-          </w:p>
-        </w:tc>
-        <w:tc>
-          <w:tcPr>
-            <w:tcW w:w="1965" w:type="dxa"/>
-            <w:tcBorders>
-              <w:top w:val="single" w:sz="4" w:space="0" w:color="000000" w:themeColor="text1"/>
-              <w:left w:val="single" w:sz="4" w:space="0" w:color="000000" w:themeColor="text1"/>
-              <w:bottom w:val="single" w:sz="4" w:space="0" w:color="000000" w:themeColor="text1"/>
-              <w:right w:val="single" w:sz="4" w:space="0" w:color="000000" w:themeColor="text1"/>
-            </w:tcBorders>
-          </w:tcPr>
-          <w:p>
-            <w:pPr>
-              <w:spacing w:line="240" w:lineRule="auto"/>
-              <w:jc w:val="center"/>
-            </w:pPr>
-          </w:p>
-        </w:tc>
-        <w:tc>
-          <w:tcPr>
-            <w:tcW w:w="1620" w:type="dxa"/>
-            <w:tcBorders>
-              <w:top w:val="single" w:sz="4" w:space="0" w:color="000000" w:themeColor="text1"/>
-              <w:left w:val="single" w:sz="4" w:space="0" w:color="000000" w:themeColor="text1"/>
-              <w:bottom w:val="single" w:sz="4" w:space="0" w:color="000000" w:themeColor="text1"/>
-              <w:right w:val="single" w:sz="4" w:space="0" w:color="000000" w:themeColor="text1"/>
-            </w:tcBorders>
-          </w:tcPr>
-          <w:p>
-            <w:pPr>
-              <w:spacing w:line="240" w:lineRule="auto"/>
-              <w:jc w:val="center"/>
-              <w:rPr>
-                <w:b/>
-                <w:bCs/>
-                <w:color w:val="000000" w:themeColor="text1"/>
-                <w:sz w:val="20"/>
-                <w:szCs w:val="20"/>
-              </w:rPr>
-            </w:pPr>
-          </w:p>
-        </w:tc>
-        <w:tc>
-          <w:tcPr>
-            <w:tcW w:w="3285" w:type="dxa"/>
-            <w:tcBorders>
-              <w:top w:val="single" w:sz="4" w:space="0" w:color="000000" w:themeColor="text1"/>
-              <w:left w:val="single" w:sz="4" w:space="0" w:color="000000" w:themeColor="text1"/>
-              <w:bottom w:val="single" w:sz="4" w:space="0" w:color="000000" w:themeColor="text1"/>
-              <w:right w:val="single" w:sz="4" w:space="0" w:color="000000" w:themeColor="text1"/>
-            </w:tcBorders>
-          </w:tcPr>
-          <w:p>
-            <w:pPr>
-              <w:spacing w:line="240" w:lineRule="auto"/>
-              <w:jc w:val="center"/>
-              <w:rPr>
-                <w:b/>
-                <w:bCs/>
-                <w:color w:val="000000" w:themeColor="text1"/>
-                <w:sz w:val="20"/>
-                <w:szCs w:val="20"/>
-              </w:rPr>
-            </w:pPr>
-          </w:p>
-        </w:tc>
-      </w:tr>
     </w:tbl>
     <w:p>
       <w:pPr>
@@ -2721,7 +2537,7 @@
       <w:r>
         <w:t>Propósito y Justificación del Proyecto</w:t>
       </w:r>
-      <w:bookmarkEnd w:id="9"/>
+      <w:bookmarkEnd w:id="12"/>
       <w:bookmarkEnd w:id="13"/>
     </w:p>
     <w:tbl>
@@ -2762,171 +2578,279 @@
               <w:rPr>
                 <w:color w:val="000000" w:themeColor="text1"/>
               </w:rPr>
-              <w:t>de la comunidad “</w:t>
-            </w:r>
-            <w:proofErr w:type="spellStart"/>
+              <w:t xml:space="preserve">de la comunidad “Winer’s” </w:t>
+            </w:r>
             <w:r>
               <w:rPr>
                 <w:color w:val="000000" w:themeColor="text1"/>
               </w:rPr>
-              <w:t>Winer’s</w:t>
-            </w:r>
-            <w:proofErr w:type="spellEnd"/>
+              <w:t xml:space="preserve">compartir sus experiencias con los productos vínicos ofrecidos por los viñedos </w:t>
+            </w:r>
             <w:r>
               <w:rPr>
                 <w:color w:val="000000" w:themeColor="text1"/>
               </w:rPr>
-              <w:t xml:space="preserve">” </w:t>
+              <w:t xml:space="preserve">distribuidos por todo el mundo, de manera </w:t>
             </w:r>
             <w:r>
               <w:rPr>
                 <w:color w:val="000000" w:themeColor="text1"/>
               </w:rPr>
-              <w:t xml:space="preserve">compartir sus experiencias con los productos vínicos ofrecidos por los viñedos </w:t>
+              <w:t>que la información proveniente de sus experiencias sea relevante y útil para los demás miembros de la comunidad</w:t>
             </w:r>
             <w:r>
               <w:rPr>
                 <w:color w:val="000000" w:themeColor="text1"/>
               </w:rPr>
-              <w:t xml:space="preserve">distribuidos por todo el mundo, de manera </w:t>
+              <w:t xml:space="preserve">. </w:t>
             </w:r>
             <w:r>
               <w:rPr>
                 <w:color w:val="000000" w:themeColor="text1"/>
               </w:rPr>
-              <w:t>que la información proveniente de sus experiencias sea relevante y útil para los demás miembros de la comunidad</w:t>
+              <w:t>Además,</w:t>
             </w:r>
             <w:r>
               <w:rPr>
                 <w:color w:val="000000" w:themeColor="text1"/>
               </w:rPr>
-              <w:t xml:space="preserve">. </w:t>
+              <w:t xml:space="preserve"> se plantea la idea de usar la plataforma como un medio de “</w:t>
             </w:r>
             <w:r>
               <w:rPr>
                 <w:color w:val="000000" w:themeColor="text1"/>
               </w:rPr>
-              <w:t>Además,</w:t>
+              <w:t>culturización</w:t>
             </w:r>
             <w:r>
               <w:rPr>
                 <w:color w:val="000000" w:themeColor="text1"/>
               </w:rPr>
-              <w:t xml:space="preserve"> se plantea la idea de usar la plataforma como un medio de “</w:t>
+              <w:t>” para personas que no pertenecen a la comunidad pero</w:t>
             </w:r>
             <w:r>
               <w:rPr>
                 <w:color w:val="000000" w:themeColor="text1"/>
               </w:rPr>
-              <w:t>culturización</w:t>
+              <w:t xml:space="preserve"> </w:t>
             </w:r>
             <w:r>
               <w:rPr>
                 <w:color w:val="000000" w:themeColor="text1"/>
               </w:rPr>
-              <w:t>” para personas que no pertenecen a la comunidad pero</w:t>
+              <w:t xml:space="preserve">que </w:t>
             </w:r>
             <w:r>
               <w:rPr>
                 <w:color w:val="000000" w:themeColor="text1"/>
               </w:rPr>
+              <w:t>buscan</w:t>
+            </w:r>
+            <w:r>
+              <w:rPr>
+                <w:color w:val="000000" w:themeColor="text1"/>
+              </w:rPr>
+              <w:t xml:space="preserve"> más información ya sea sobre los productos vínicos o de los viñedos.</w:t>
+            </w:r>
+            <w:r>
+              <w:rPr>
+                <w:color w:val="000000" w:themeColor="text1"/>
+              </w:rPr>
+              <w:t xml:space="preserve"> Debido a esto la aplicación busca exponer </w:t>
+            </w:r>
+            <w:r>
+              <w:rPr>
+                <w:color w:val="000000" w:themeColor="text1"/>
+              </w:rPr>
+              <w:t>e</w:t>
+            </w:r>
+            <w:r>
+              <w:rPr>
+                <w:color w:val="000000" w:themeColor="text1"/>
+              </w:rPr>
+              <w:t>l mundo del vino a cualquier interesado.</w:t>
+            </w:r>
+            <w:r>
+              <w:rPr>
+                <w:color w:val="000000" w:themeColor="text1"/>
+              </w:rPr>
+              <w:t xml:space="preserve"> Por el hecho de que los viñedos se distribuyen por todo el mundo, el aplicativo </w:t>
+            </w:r>
+            <w:r>
+              <w:rPr>
+                <w:color w:val="000000" w:themeColor="text1"/>
+              </w:rPr>
+              <w:t xml:space="preserve">permite hacer filtros por ubicaciones, </w:t>
+            </w:r>
+            <w:r>
+              <w:rPr>
+                <w:color w:val="000000" w:themeColor="text1"/>
+              </w:rPr>
+              <w:t xml:space="preserve">mostrando así los </w:t>
+            </w:r>
+            <w:r>
+              <w:rPr>
+                <w:color w:val="000000" w:themeColor="text1"/>
+              </w:rPr>
+              <w:t xml:space="preserve">viñedos existentes en el lugar de interés. Se busca que </w:t>
+            </w:r>
+            <w:r>
+              <w:rPr>
+                <w:color w:val="000000" w:themeColor="text1"/>
+              </w:rPr>
+              <w:t xml:space="preserve">el aplicativo sea lo más detallado posible con respecto a las características de </w:t>
+            </w:r>
+            <w:r>
+              <w:rPr>
+                <w:color w:val="000000" w:themeColor="text1"/>
+              </w:rPr>
+              <w:t>vida y producción del vino</w:t>
+            </w:r>
+            <w:r>
+              <w:rPr>
+                <w:color w:val="000000" w:themeColor="text1"/>
+              </w:rPr>
+              <w:t xml:space="preserve">. Por lo </w:t>
+            </w:r>
+            <w:r>
+              <w:rPr>
+                <w:color w:val="000000" w:themeColor="text1"/>
+              </w:rPr>
+              <w:t>tanto,</w:t>
+            </w:r>
+            <w:r>
+              <w:rPr>
+                <w:color w:val="000000" w:themeColor="text1"/>
+              </w:rPr>
+              <w:t xml:space="preserve"> es necesario exponer las características del viñedo y características de la elaboración, almacenamiento y otros procesos relacionados con la vida </w:t>
+            </w:r>
+            <w:r>
+              <w:rPr>
+                <w:color w:val="000000" w:themeColor="text1"/>
+              </w:rPr>
+              <w:t xml:space="preserve">del vino. </w:t>
+            </w:r>
+            <w:r>
+              <w:rPr>
+                <w:color w:val="000000" w:themeColor="text1"/>
+              </w:rPr>
               <w:t xml:space="preserve"> </w:t>
             </w:r>
-            <w:r>
+          </w:p>
+          <w:p>
+            <w:pPr>
+              <w:spacing w:after="0" w:line="240" w:lineRule="auto"/>
+              <w:rPr>
+                <w:color w:val="000000"/>
+              </w:rPr>
+            </w:pPr>
+          </w:p>
+          <w:p>
+            <w:pPr>
+              <w:spacing w:after="0" w:line="240" w:lineRule="auto"/>
               <w:rPr>
                 <w:color w:val="000000" w:themeColor="text1"/>
               </w:rPr>
-              <w:t xml:space="preserve">que </w:t>
-            </w:r>
+            </w:pPr>
             <w:r>
               <w:rPr>
                 <w:color w:val="000000" w:themeColor="text1"/>
               </w:rPr>
-              <w:t>buscan</w:t>
+              <w:t xml:space="preserve">Debido a que la aplicación </w:t>
             </w:r>
             <w:r>
               <w:rPr>
                 <w:color w:val="000000" w:themeColor="text1"/>
               </w:rPr>
-              <w:t xml:space="preserve"> más información ya sea sobre los productos vínicos o de los viñedos.</w:t>
+              <w:t>está</w:t>
             </w:r>
             <w:r>
               <w:rPr>
                 <w:color w:val="000000" w:themeColor="text1"/>
               </w:rPr>
-              <w:t xml:space="preserve"> Debido a esto la aplicación busca exponer </w:t>
+              <w:t xml:space="preserve"> pensada </w:t>
             </w:r>
             <w:r>
               <w:rPr>
                 <w:color w:val="000000" w:themeColor="text1"/>
               </w:rPr>
-              <w:t>e</w:t>
+              <w:t xml:space="preserve">tanto </w:t>
             </w:r>
             <w:r>
               <w:rPr>
                 <w:color w:val="000000" w:themeColor="text1"/>
               </w:rPr>
-              <w:t>l mundo del vino a cualquier interesado.</w:t>
+              <w:t>p</w:t>
             </w:r>
             <w:r>
               <w:rPr>
                 <w:color w:val="000000" w:themeColor="text1"/>
               </w:rPr>
-              <w:t xml:space="preserve"> Por el hecho de que los viñedos se distribuyen por todo el mundo, el aplicativo </w:t>
+              <w:t xml:space="preserve">ara que los usuarios ingresen y </w:t>
             </w:r>
             <w:r>
               <w:rPr>
                 <w:color w:val="000000" w:themeColor="text1"/>
               </w:rPr>
-              <w:t xml:space="preserve">permite hacer filtros por ubicaciones, </w:t>
+              <w:t xml:space="preserve">compartan sus experiencias como para consultar únicamente información relevante a vinos y viñedos, </w:t>
             </w:r>
             <w:r>
               <w:rPr>
                 <w:color w:val="000000" w:themeColor="text1"/>
               </w:rPr>
-              <w:t xml:space="preserve">mostrando así los </w:t>
+              <w:t xml:space="preserve">los usuarios no deben registrarse ni almacenar sus datos ya que este proceso no es relevante para la comunidad, misma que prioriza </w:t>
             </w:r>
             <w:r>
               <w:rPr>
                 <w:color w:val="000000" w:themeColor="text1"/>
               </w:rPr>
-              <w:t xml:space="preserve">viñedos existentes en el lugar de interés. Se busca que </w:t>
+              <w:t xml:space="preserve">la agilidad de consulta y fácil </w:t>
             </w:r>
             <w:r>
               <w:rPr>
                 <w:color w:val="000000" w:themeColor="text1"/>
               </w:rPr>
-              <w:t xml:space="preserve">el aplicativo sea lo más detallado posible con respecto a las características de </w:t>
-            </w:r>
-            <w:r>
+              <w:t xml:space="preserve">registro de sus experiencias. </w:t>
+            </w:r>
+          </w:p>
+          <w:p>
+            <w:pPr>
+              <w:spacing w:after="0" w:line="240" w:lineRule="auto"/>
+              <w:rPr>
+                <w:color w:val="000000"/>
+              </w:rPr>
+            </w:pPr>
+          </w:p>
+          <w:p>
+            <w:pPr>
+              <w:spacing w:after="0" w:line="240" w:lineRule="auto"/>
               <w:rPr>
                 <w:color w:val="000000" w:themeColor="text1"/>
               </w:rPr>
-              <w:t>vida y producción del vino</w:t>
-            </w:r>
+            </w:pPr>
             <w:r>
               <w:rPr>
                 <w:color w:val="000000" w:themeColor="text1"/>
               </w:rPr>
-              <w:t xml:space="preserve">. Por lo </w:t>
+              <w:t xml:space="preserve">Desde el punto de vista técnico, el proyecto integra una arquitectura basada </w:t>
             </w:r>
             <w:r>
               <w:rPr>
                 <w:color w:val="000000" w:themeColor="text1"/>
               </w:rPr>
-              <w:t>tanto,</w:t>
+              <w:t>en capas</w:t>
             </w:r>
             <w:r>
               <w:rPr>
                 <w:color w:val="000000" w:themeColor="text1"/>
               </w:rPr>
-              <w:t xml:space="preserve"> es necesario exponer las características del viñedo y características de la elaboración, almacenamiento y otros procesos relacionados con la vida </w:t>
+              <w:t xml:space="preserve">, un aplicativo web desarrollado en </w:t>
             </w:r>
             <w:r>
               <w:rPr>
                 <w:color w:val="000000" w:themeColor="text1"/>
               </w:rPr>
-              <w:t xml:space="preserve">del vino. </w:t>
+              <w:t>React</w:t>
             </w:r>
             <w:r>
               <w:rPr>
@@ -2934,269 +2858,113 @@
               </w:rPr>
               <w:t xml:space="preserve"> </w:t>
             </w:r>
-          </w:p>
-          <w:p>
-            <w:pPr>
-              <w:spacing w:after="0" w:line="240" w:lineRule="auto"/>
-              <w:rPr>
-                <w:color w:val="000000"/>
-              </w:rPr>
-            </w:pPr>
-          </w:p>
-          <w:p>
-            <w:pPr>
-              <w:spacing w:after="0" w:line="240" w:lineRule="auto"/>
+            <w:r>
               <w:rPr>
                 <w:color w:val="000000" w:themeColor="text1"/>
               </w:rPr>
-            </w:pPr>
+              <w:t xml:space="preserve">el cual </w:t>
+            </w:r>
             <w:r>
               <w:rPr>
                 <w:color w:val="000000" w:themeColor="text1"/>
               </w:rPr>
-              <w:t xml:space="preserve">Debido a que la aplicación </w:t>
+              <w:t xml:space="preserve">consume </w:t>
             </w:r>
             <w:r>
               <w:rPr>
                 <w:color w:val="000000" w:themeColor="text1"/>
               </w:rPr>
-              <w:t>está</w:t>
+              <w:t>una APIR</w:t>
             </w:r>
             <w:r>
               <w:rPr>
                 <w:color w:val="000000" w:themeColor="text1"/>
               </w:rPr>
-              <w:t xml:space="preserve"> pensada </w:t>
+              <w:t>est</w:t>
             </w:r>
             <w:r>
               <w:rPr>
                 <w:color w:val="000000" w:themeColor="text1"/>
               </w:rPr>
-              <w:t xml:space="preserve">tanto </w:t>
+              <w:t xml:space="preserve"> </w:t>
             </w:r>
             <w:r>
               <w:rPr>
                 <w:color w:val="000000" w:themeColor="text1"/>
               </w:rPr>
-              <w:t>p</w:t>
+              <w:t xml:space="preserve">en el </w:t>
             </w:r>
             <w:r>
               <w:rPr>
                 <w:color w:val="000000" w:themeColor="text1"/>
               </w:rPr>
-              <w:t xml:space="preserve">ara que los usuarios ingresen y </w:t>
+              <w:t>ba</w:t>
             </w:r>
             <w:r>
               <w:rPr>
                 <w:color w:val="000000" w:themeColor="text1"/>
               </w:rPr>
-              <w:t xml:space="preserve">compartan sus experiencias como para consultar únicamente información relevante a vinos y viñedos, </w:t>
+              <w:t>c</w:t>
             </w:r>
             <w:r>
               <w:rPr>
                 <w:color w:val="000000" w:themeColor="text1"/>
               </w:rPr>
-              <w:t xml:space="preserve">los usuarios no deben registrarse ni almacenar sus datos ya que este proceso no es relevante para la comunidad, misma que prioriza </w:t>
+              <w:t>kend</w:t>
             </w:r>
             <w:r>
               <w:rPr>
                 <w:color w:val="000000" w:themeColor="text1"/>
               </w:rPr>
-              <w:t xml:space="preserve">la agilidad de consulta y fácil </w:t>
+              <w:t xml:space="preserve"> desarrollada con SpringBoot</w:t>
             </w:r>
             <w:r>
               <w:rPr>
                 <w:color w:val="000000" w:themeColor="text1"/>
               </w:rPr>
-              <w:t xml:space="preserve">registro de sus experiencias. </w:t>
-            </w:r>
-          </w:p>
-          <w:p>
-            <w:pPr>
-              <w:spacing w:after="0" w:line="240" w:lineRule="auto"/>
-              <w:rPr>
-                <w:color w:val="000000"/>
-              </w:rPr>
-            </w:pPr>
-          </w:p>
-          <w:p>
-            <w:pPr>
-              <w:spacing w:after="0" w:line="240" w:lineRule="auto"/>
+              <w:t>, este</w:t>
+            </w:r>
+            <w:r>
               <w:rPr>
                 <w:color w:val="000000" w:themeColor="text1"/>
               </w:rPr>
-            </w:pPr>
+              <w:t xml:space="preserve"> hace uso de </w:t>
+            </w:r>
             <w:r>
               <w:rPr>
                 <w:color w:val="000000" w:themeColor="text1"/>
               </w:rPr>
-              <w:t xml:space="preserve">Desde el punto de vista técnico, el proyecto integra una arquitectura basada </w:t>
+              <w:t>M</w:t>
             </w:r>
             <w:r>
               <w:rPr>
                 <w:color w:val="000000" w:themeColor="text1"/>
               </w:rPr>
-              <w:t>en capas</w:t>
+              <w:t>ongoDB</w:t>
             </w:r>
             <w:r>
               <w:rPr>
                 <w:color w:val="000000" w:themeColor="text1"/>
               </w:rPr>
-              <w:t xml:space="preserve">, un aplicativo web desarrollado en </w:t>
-            </w:r>
-            <w:proofErr w:type="spellStart"/>
+              <w:t xml:space="preserve"> y MySQL para </w:t>
+            </w:r>
             <w:r>
               <w:rPr>
                 <w:color w:val="000000" w:themeColor="text1"/>
               </w:rPr>
-              <w:t>React</w:t>
-            </w:r>
-            <w:proofErr w:type="spellEnd"/>
+              <w:t>alojar los datos.</w:t>
+            </w:r>
             <w:r>
               <w:rPr>
                 <w:color w:val="000000" w:themeColor="text1"/>
               </w:rPr>
-              <w:t xml:space="preserve"> </w:t>
+              <w:t xml:space="preserve"> Las bases de datos </w:t>
             </w:r>
             <w:r>
               <w:rPr>
                 <w:color w:val="000000" w:themeColor="text1"/>
               </w:rPr>
-              <w:t xml:space="preserve">el cual </w:t>
-            </w:r>
-            <w:r>
-              <w:rPr>
-                <w:color w:val="000000" w:themeColor="text1"/>
-              </w:rPr>
-              <w:t xml:space="preserve">consume </w:t>
-            </w:r>
-            <w:r>
-              <w:rPr>
-                <w:color w:val="000000" w:themeColor="text1"/>
-              </w:rPr>
-              <w:t xml:space="preserve">una </w:t>
-            </w:r>
-            <w:proofErr w:type="spellStart"/>
-            <w:r>
-              <w:rPr>
-                <w:color w:val="000000" w:themeColor="text1"/>
-              </w:rPr>
-              <w:t>APIR</w:t>
-            </w:r>
-            <w:r>
-              <w:rPr>
-                <w:color w:val="000000" w:themeColor="text1"/>
-              </w:rPr>
-              <w:t>est</w:t>
-            </w:r>
-            <w:proofErr w:type="spellEnd"/>
-            <w:r>
-              <w:rPr>
-                <w:color w:val="000000" w:themeColor="text1"/>
-              </w:rPr>
-              <w:t xml:space="preserve"> </w:t>
-            </w:r>
-            <w:r>
-              <w:rPr>
-                <w:color w:val="000000" w:themeColor="text1"/>
-              </w:rPr>
-              <w:t xml:space="preserve">en el </w:t>
-            </w:r>
-            <w:proofErr w:type="spellStart"/>
-            <w:r>
-              <w:rPr>
-                <w:color w:val="000000" w:themeColor="text1"/>
-              </w:rPr>
-              <w:t>ba</w:t>
-            </w:r>
-            <w:r>
-              <w:rPr>
-                <w:color w:val="000000" w:themeColor="text1"/>
-              </w:rPr>
-              <w:t>c</w:t>
-            </w:r>
-            <w:r>
-              <w:rPr>
-                <w:color w:val="000000" w:themeColor="text1"/>
-              </w:rPr>
-              <w:t>kend</w:t>
-            </w:r>
-            <w:proofErr w:type="spellEnd"/>
-            <w:r>
-              <w:rPr>
-                <w:color w:val="000000" w:themeColor="text1"/>
-              </w:rPr>
-              <w:t xml:space="preserve"> desarrollada con </w:t>
-            </w:r>
-            <w:proofErr w:type="spellStart"/>
-            <w:r>
-              <w:rPr>
-                <w:color w:val="000000" w:themeColor="text1"/>
-              </w:rPr>
-              <w:t>SpringBoot</w:t>
-            </w:r>
-            <w:proofErr w:type="spellEnd"/>
-            <w:r>
-              <w:rPr>
-                <w:color w:val="000000" w:themeColor="text1"/>
-              </w:rPr>
-              <w:t>, este</w:t>
-            </w:r>
-            <w:r>
-              <w:rPr>
-                <w:color w:val="000000" w:themeColor="text1"/>
-              </w:rPr>
-              <w:t xml:space="preserve"> hace uso de </w:t>
-            </w:r>
-            <w:r>
-              <w:rPr>
-                <w:color w:val="000000" w:themeColor="text1"/>
-              </w:rPr>
-              <w:t>M</w:t>
-            </w:r>
-            <w:r>
-              <w:rPr>
-                <w:color w:val="000000" w:themeColor="text1"/>
-              </w:rPr>
-              <w:t>ongoDB</w:t>
-            </w:r>
-            <w:r>
-              <w:rPr>
-                <w:color w:val="000000" w:themeColor="text1"/>
-              </w:rPr>
-              <w:t xml:space="preserve"> y MySQL para </w:t>
-            </w:r>
-            <w:r>
-              <w:rPr>
-                <w:color w:val="000000" w:themeColor="text1"/>
-              </w:rPr>
-              <w:t>alojar los datos.</w:t>
-            </w:r>
-            <w:r>
-              <w:rPr>
-                <w:color w:val="000000" w:themeColor="text1"/>
-              </w:rPr>
-              <w:t xml:space="preserve"> Las bases de datos </w:t>
-            </w:r>
-            <w:r>
-              <w:rPr>
-                <w:color w:val="000000" w:themeColor="text1"/>
-              </w:rPr>
-              <w:t xml:space="preserve">se integran con </w:t>
-            </w:r>
-            <w:proofErr w:type="spellStart"/>
-            <w:r>
-              <w:rPr>
-                <w:color w:val="000000" w:themeColor="text1"/>
-              </w:rPr>
-              <w:t>Flyway</w:t>
-            </w:r>
-            <w:proofErr w:type="spellEnd"/>
-            <w:r>
-              <w:rPr>
-                <w:color w:val="000000" w:themeColor="text1"/>
-              </w:rPr>
-              <w:t xml:space="preserve"> para </w:t>
+              <w:t xml:space="preserve">se integran con Flyway para </w:t>
             </w:r>
             <w:r>
               <w:rPr>
@@ -3209,21 +2977,53 @@
               <w:rPr>
                 <w:color w:val="000000" w:themeColor="text1"/>
               </w:rPr>
-              <w:t xml:space="preserve">versiones en cuanto a la estructura y cambios realizados sobre el </w:t>
-            </w:r>
-            <w:proofErr w:type="spellStart"/>
-            <w:r>
+              <w:t xml:space="preserve">versiones en cuanto a la estructura y cambios realizados sobre el schema. </w:t>
+            </w:r>
+          </w:p>
+          <w:p>
+            <w:pPr>
+              <w:spacing w:after="0" w:line="240" w:lineRule="auto"/>
               <w:rPr>
                 <w:color w:val="000000" w:themeColor="text1"/>
               </w:rPr>
-              <w:t>schema</w:t>
-            </w:r>
-            <w:proofErr w:type="spellEnd"/>
-            <w:r>
+            </w:pPr>
+          </w:p>
+          <w:p>
+            <w:pPr>
+              <w:spacing w:after="0" w:line="240" w:lineRule="auto"/>
               <w:rPr>
                 <w:color w:val="000000" w:themeColor="text1"/>
               </w:rPr>
-              <w:t xml:space="preserve">. </w:t>
+            </w:pPr>
+            <w:r>
+              <w:rPr>
+                <w:color w:val="000000" w:themeColor="text1"/>
+              </w:rPr>
+              <w:t xml:space="preserve">Finalmente se implementa el uso de maquinas virtuales gestionadas </w:t>
+            </w:r>
+            <w:r>
+              <w:rPr>
+                <w:color w:val="000000" w:themeColor="text1"/>
+              </w:rPr>
+              <w:t xml:space="preserve">y desplegadas con Amazon Web Services para cada una de las capas </w:t>
+            </w:r>
+            <w:r>
+              <w:rPr>
+                <w:color w:val="000000" w:themeColor="text1"/>
+              </w:rPr>
+              <w:t xml:space="preserve">del sistema. </w:t>
+            </w:r>
+            <w:r>
+              <w:rPr>
+                <w:color w:val="000000" w:themeColor="text1"/>
+              </w:rPr>
+              <w:t xml:space="preserve"> </w:t>
+            </w:r>
+            <w:r>
+              <w:rPr>
+                <w:color w:val="000000" w:themeColor="text1"/>
+              </w:rPr>
+              <w:t xml:space="preserve"> </w:t>
             </w:r>
           </w:p>
           <w:p>
@@ -3245,95 +3045,7 @@
               <w:rPr>
                 <w:color w:val="000000" w:themeColor="text1"/>
               </w:rPr>
-              <w:t xml:space="preserve">Finalmente se implementa el uso de </w:t>
-            </w:r>
-            <w:proofErr w:type="spellStart"/>
-            <w:r>
-              <w:rPr>
-                <w:color w:val="000000" w:themeColor="text1"/>
-              </w:rPr>
-              <w:t>maquinas</w:t>
-            </w:r>
-            <w:proofErr w:type="spellEnd"/>
-            <w:r>
-              <w:rPr>
-                <w:color w:val="000000" w:themeColor="text1"/>
-              </w:rPr>
-              <w:t xml:space="preserve"> virtuales gestionadas </w:t>
-            </w:r>
-            <w:r>
-              <w:rPr>
-                <w:color w:val="000000" w:themeColor="text1"/>
-              </w:rPr>
-              <w:t xml:space="preserve">y desplegadas con Amazon Web </w:t>
-            </w:r>
-            <w:proofErr w:type="spellStart"/>
-            <w:r>
-              <w:rPr>
-                <w:color w:val="000000" w:themeColor="text1"/>
-              </w:rPr>
-              <w:t>Services</w:t>
-            </w:r>
-            <w:proofErr w:type="spellEnd"/>
-            <w:r>
-              <w:rPr>
-                <w:color w:val="000000" w:themeColor="text1"/>
-              </w:rPr>
-              <w:t xml:space="preserve"> para cada una de las capas </w:t>
-            </w:r>
-            <w:r>
-              <w:rPr>
-                <w:color w:val="000000" w:themeColor="text1"/>
-              </w:rPr>
-              <w:t xml:space="preserve">del sistema. </w:t>
-            </w:r>
-            <w:r>
-              <w:rPr>
-                <w:color w:val="000000" w:themeColor="text1"/>
-              </w:rPr>
-              <w:t xml:space="preserve"> </w:t>
-            </w:r>
-            <w:r>
-              <w:rPr>
-                <w:color w:val="000000" w:themeColor="text1"/>
-              </w:rPr>
-              <w:t xml:space="preserve"> </w:t>
-            </w:r>
-          </w:p>
-          <w:p>
-            <w:pPr>
-              <w:spacing w:after="0" w:line="240" w:lineRule="auto"/>
-              <w:rPr>
-                <w:color w:val="000000" w:themeColor="text1"/>
-              </w:rPr>
-            </w:pPr>
-          </w:p>
-          <w:p>
-            <w:pPr>
-              <w:spacing w:after="0" w:line="240" w:lineRule="auto"/>
-              <w:rPr>
-                <w:color w:val="000000" w:themeColor="text1"/>
-              </w:rPr>
-            </w:pPr>
-            <w:r>
-              <w:rPr>
-                <w:color w:val="000000" w:themeColor="text1"/>
-              </w:rPr>
-              <w:t xml:space="preserve">Esta estructura permite una alta escalabilidad y facilita la implementación de nuevas funcionalidades. Asimismo, se ha diseñado con un enfoque modular e independiente, lo que permite que la API pueda ser consumida desde cualquier cliente web, sin importar el </w:t>
-            </w:r>
-            <w:proofErr w:type="spellStart"/>
-            <w:r>
-              <w:rPr>
-                <w:color w:val="000000" w:themeColor="text1"/>
-              </w:rPr>
-              <w:t>framework</w:t>
-            </w:r>
-            <w:proofErr w:type="spellEnd"/>
-            <w:r>
-              <w:rPr>
-                <w:color w:val="000000" w:themeColor="text1"/>
-              </w:rPr>
-              <w:t xml:space="preserve"> utilizado. Esta característica favorece la reutilización, la mantenibilidad y la interoperabilidad del sistema en distintos entornos tecnológicos.</w:t>
+              <w:t>Esta estructura permite una alta escalabilidad y facilita la implementación de nuevas funcionalidades. Asimismo, se ha diseñado con un enfoque modular e independiente, lo que permite que la API pueda ser consumida desde cualquier cliente web, sin importar el framework utilizado. Esta característica favorece la reutilización, la mantenibilidad y la interoperabilidad del sistema en distintos entornos tecnológicos.</w:t>
             </w:r>
           </w:p>
         </w:tc>
@@ -3502,29 +3214,8 @@
               <w:spacing w:after="0" w:line="240" w:lineRule="auto"/>
             </w:pPr>
             <w:r>
-              <w:t xml:space="preserve">Modelo E-R Relación con notación Barker o </w:t>
-            </w:r>
-            <w:proofErr w:type="spellStart"/>
-            <w:r>
-              <w:t>Crow’s</w:t>
-            </w:r>
-            <w:proofErr w:type="spellEnd"/>
-            <w:r>
-              <w:t xml:space="preserve"> Foot (Pata de Gallina). – Data </w:t>
-            </w:r>
-            <w:proofErr w:type="spellStart"/>
-            <w:r>
-              <w:t>Modeler</w:t>
-            </w:r>
-            <w:proofErr w:type="spellEnd"/>
-            <w:r>
-              <w:t xml:space="preserve"> o </w:t>
-            </w:r>
-            <w:proofErr w:type="spellStart"/>
-            <w:r>
-              <w:t>Workbench</w:t>
-            </w:r>
-            <w:proofErr w:type="spellEnd"/>
+              <w:t>Modelo E-R Relación con notación Barker o Crow’s Foot (Pata de Gallina). – Data Modeler o Workbench</w:t>
+            </w:r>
           </w:p>
           <w:p>
             <w:pPr>
@@ -3535,29 +3226,8 @@
               <w:spacing w:after="0" w:line="240" w:lineRule="auto"/>
             </w:pPr>
             <w:r>
-              <w:t xml:space="preserve">Modelo relacional Relación con notación Barker o </w:t>
-            </w:r>
-            <w:proofErr w:type="spellStart"/>
-            <w:r>
-              <w:t>Crow’s</w:t>
-            </w:r>
-            <w:proofErr w:type="spellEnd"/>
-            <w:r>
-              <w:t xml:space="preserve"> Foot (Pata de Gallina). – Data </w:t>
-            </w:r>
-            <w:proofErr w:type="spellStart"/>
-            <w:r>
-              <w:t>Modeler</w:t>
-            </w:r>
-            <w:proofErr w:type="spellEnd"/>
-            <w:r>
-              <w:t xml:space="preserve"> o </w:t>
-            </w:r>
-            <w:proofErr w:type="spellStart"/>
-            <w:r>
-              <w:t>Workbench</w:t>
-            </w:r>
-            <w:proofErr w:type="spellEnd"/>
+              <w:t>Modelo relacional Relación con notación Barker o Crow’s Foot (Pata de Gallina). – Data Modeler o Workbench</w:t>
+            </w:r>
           </w:p>
           <w:p>
             <w:pPr>
@@ -4036,15 +3706,7 @@
         <w:spacing w:after="240" w:line="240" w:lineRule="auto"/>
       </w:pPr>
       <w:r>
-        <w:t xml:space="preserve">Se asume que a la comunidad </w:t>
-      </w:r>
-      <w:proofErr w:type="spellStart"/>
-      <w:r>
-        <w:t>Winer’s</w:t>
-      </w:r>
-      <w:proofErr w:type="spellEnd"/>
-      <w:r>
-        <w:t xml:space="preserve"> no les interesa el manejo de datos de los usuarios y críticos.   </w:t>
+        <w:t xml:space="preserve">Se asume que a la comunidad Winer’s no les interesa el manejo de datos de los usuarios y críticos.   </w:t>
       </w:r>
       <w:r>
         <w:br/>
@@ -4071,15 +3733,7 @@
         <w:spacing w:after="0"/>
       </w:pPr>
       <w:r>
-        <w:t xml:space="preserve">El presupuesto estimado para este proyecto se plantea con la fecha de inicio definida para el 28 de febrero del 2026 y una fecha de finalización estimada para el 22 de mayo de 2026. Se consideran únicamente los días hábiles laborales según el calendario colombiano. Se tienen en cuenta porcentajes del 3 y 5 % los cuales suponen por un lado gastos de infraestructura y por </w:t>
-      </w:r>
-      <w:proofErr w:type="gramStart"/>
-      <w:r>
-        <w:t>el otro gastos no anticipados</w:t>
-      </w:r>
-      <w:proofErr w:type="gramEnd"/>
-      <w:r>
-        <w:t xml:space="preserve"> o repentinos. </w:t>
+        <w:t xml:space="preserve">El presupuesto estimado para este proyecto se plantea con la fecha de inicio definida para el 28 de febrero del 2026 y una fecha de finalización estimada para el 22 de mayo de 2026. Se consideran únicamente los días hábiles laborales según el calendario colombiano. Se tienen en cuenta porcentajes del 3 y 5 % los cuales suponen por un lado gastos de infraestructura y por el otro gastos no anticipados o repentinos. </w:t>
       </w:r>
       <w:r>
         <w:br/>
@@ -4219,19 +3873,11 @@
             <w:pPr>
               <w:spacing w:before="40" w:after="40"/>
             </w:pPr>
-            <w:proofErr w:type="gramStart"/>
             <w:r>
               <w:rPr>
                 <w:b/>
               </w:rPr>
-              <w:t>Total</w:t>
-            </w:r>
-            <w:proofErr w:type="gramEnd"/>
-            <w:r>
-              <w:rPr>
-                <w:b/>
-              </w:rPr>
-              <w:t xml:space="preserve"> Proyecto </w:t>
+              <w:t xml:space="preserve">Total Proyecto </w:t>
             </w:r>
           </w:p>
         </w:tc>
@@ -4345,13 +3991,8 @@
               <w:spacing w:before="40" w:after="40"/>
             </w:pPr>
             <w:r>
-              <w:t xml:space="preserve">Desarrollador </w:t>
-            </w:r>
-            <w:proofErr w:type="spellStart"/>
-            <w:r>
-              <w:t>Backend</w:t>
-            </w:r>
-            <w:proofErr w:type="spellEnd"/>
+              <w:t>Desarrollador Backend</w:t>
+            </w:r>
           </w:p>
         </w:tc>
         <w:tc>
@@ -4434,13 +4075,8 @@
             </w:pPr>
             <w:r>
               <w:lastRenderedPageBreak/>
-              <w:t xml:space="preserve">Desarrollador </w:t>
-            </w:r>
-            <w:proofErr w:type="spellStart"/>
-            <w:r>
-              <w:t>Frontend</w:t>
-            </w:r>
-            <w:proofErr w:type="spellEnd"/>
+              <w:t>Desarrollador Frontend</w:t>
+            </w:r>
           </w:p>
         </w:tc>
         <w:tc>
@@ -4775,21 +4411,12 @@
             <w:pPr>
               <w:spacing w:after="0"/>
             </w:pPr>
-            <w:proofErr w:type="gramStart"/>
             <w:r>
               <w:rPr>
                 <w:b/>
                 <w:bCs/>
               </w:rPr>
-              <w:t>TOTAL</w:t>
-            </w:r>
-            <w:proofErr w:type="gramEnd"/>
-            <w:r>
-              <w:rPr>
-                <w:b/>
-                <w:bCs/>
-              </w:rPr>
-              <w:t xml:space="preserve"> DEL PROYECTO</w:t>
+              <w:t>TOTAL DEL PROYECTO</w:t>
             </w:r>
           </w:p>
         </w:tc>
@@ -4836,11 +4463,9 @@
       <w:r>
         <w:t>ista de Interesados (</w:t>
       </w:r>
-      <w:proofErr w:type="spellStart"/>
       <w:r>
         <w:t>StakeHolders</w:t>
       </w:r>
-      <w:proofErr w:type="spellEnd"/>
       <w:r>
         <w:t>)</w:t>
       </w:r>
@@ -4986,15 +4611,7 @@
           </w:tcPr>
           <w:p>
             <w:r>
-              <w:t xml:space="preserve">Explorar el </w:t>
-            </w:r>
-            <w:proofErr w:type="spellStart"/>
-            <w:r>
-              <w:t>dashboard</w:t>
-            </w:r>
-            <w:proofErr w:type="spellEnd"/>
-            <w:r>
-              <w:t>, filtrar viñedos y vinos por ubicación</w:t>
+              <w:t>Explorar el dashboard, filtrar viñedos y vinos por ubicación</w:t>
             </w:r>
           </w:p>
         </w:tc>
@@ -5069,7 +4686,6 @@
             <w:bookmarkStart w:id="37" w:name="_heading=h.8aaor2t3ijrm" w:colFirst="0" w:colLast="0"/>
             <w:bookmarkStart w:id="38" w:name="_Toc1311495955"/>
             <w:bookmarkEnd w:id="37"/>
-            <w:proofErr w:type="spellStart"/>
             <w:r>
               <w:rPr>
                 <w:b/>
@@ -5077,7 +4693,6 @@
               </w:rPr>
               <w:t>Stakeholder</w:t>
             </w:r>
-            <w:proofErr w:type="spellEnd"/>
           </w:p>
         </w:tc>
         <w:tc>
@@ -5171,13 +4786,8 @@
           </w:tcPr>
           <w:p>
             <w:r>
-              <w:t xml:space="preserve">Desarrollador </w:t>
-            </w:r>
-            <w:proofErr w:type="spellStart"/>
-            <w:r>
-              <w:t>Backend</w:t>
-            </w:r>
-            <w:proofErr w:type="spellEnd"/>
+              <w:t>Desarrollador Backend</w:t>
+            </w:r>
           </w:p>
         </w:tc>
         <w:tc>
@@ -5198,13 +4808,8 @@
           </w:tcPr>
           <w:p>
             <w:r>
-              <w:t xml:space="preserve">API de recepción de reseñas, lógica de clasificación por formulario, filtros del </w:t>
-            </w:r>
-            <w:proofErr w:type="spellStart"/>
-            <w:r>
-              <w:t>dashboard</w:t>
-            </w:r>
-            <w:proofErr w:type="spellEnd"/>
+              <w:t>API de recepción de reseñas, lógica de clasificación por formulario, filtros del dashboard</w:t>
+            </w:r>
           </w:p>
         </w:tc>
       </w:tr>
@@ -5216,13 +4821,8 @@
           </w:tcPr>
           <w:p>
             <w:r>
-              <w:t xml:space="preserve">Desarrollador </w:t>
-            </w:r>
-            <w:proofErr w:type="spellStart"/>
-            <w:r>
-              <w:t>Frontend</w:t>
-            </w:r>
-            <w:proofErr w:type="spellEnd"/>
+              <w:t>Desarrollador Frontend</w:t>
+            </w:r>
           </w:p>
         </w:tc>
         <w:tc>
@@ -5243,15 +4843,7 @@
           </w:tcPr>
           <w:p>
             <w:r>
-              <w:t xml:space="preserve">Formulario de reseña con segmentación dinámica, </w:t>
-            </w:r>
-            <w:proofErr w:type="spellStart"/>
-            <w:r>
-              <w:t>dashboard</w:t>
-            </w:r>
-            <w:proofErr w:type="spellEnd"/>
-            <w:r>
-              <w:t xml:space="preserve"> público</w:t>
+              <w:t>Formulario de reseña con segmentación dinámica, dashboard público</w:t>
             </w:r>
           </w:p>
         </w:tc>
@@ -5263,13 +4855,8 @@
             <w:hideMark/>
           </w:tcPr>
           <w:p>
-            <w:proofErr w:type="spellStart"/>
-            <w:r>
-              <w:t>Product</w:t>
-            </w:r>
-            <w:proofErr w:type="spellEnd"/>
-            <w:r>
-              <w:t xml:space="preserve"> Owner / Patrocinador</w:t>
+            <w:r>
+              <w:t>Product Owner / Patrocinador</w:t>
             </w:r>
           </w:p>
         </w:tc>
@@ -5362,23 +4949,7 @@
     </w:p>
     <w:p>
       <w:r>
-        <w:t xml:space="preserve">El proyecto debe implementar un motor de base de datos relacional, permitiéndose el uso de MySQL, PostgreSQL, </w:t>
-      </w:r>
-      <w:proofErr w:type="spellStart"/>
-      <w:r>
-        <w:t>MariaDB</w:t>
-      </w:r>
-      <w:proofErr w:type="spellEnd"/>
-      <w:r>
-        <w:t xml:space="preserve"> o SQL Server, quedando expresamente excluido el uso de Oracle </w:t>
-      </w:r>
-      <w:proofErr w:type="spellStart"/>
-      <w:r>
-        <w:t>Database</w:t>
-      </w:r>
-      <w:proofErr w:type="spellEnd"/>
-      <w:r>
-        <w:t xml:space="preserve"> en cualquiera de sus ediciones.</w:t>
+        <w:t>El proyecto debe implementar un motor de base de datos relacional, permitiéndose el uso de MySQL, PostgreSQL, MariaDB o SQL Server, quedando expresamente excluido el uso de Oracle Database en cualquiera de sus ediciones.</w:t>
       </w:r>
     </w:p>
     <w:p>
@@ -5420,14 +4991,9 @@
           <w:numId w:val="19"/>
         </w:numPr>
       </w:pPr>
-      <w:proofErr w:type="spellStart"/>
       <w:r>
         <w:lastRenderedPageBreak/>
-        <w:t>Triggers</w:t>
-      </w:r>
-      <w:proofErr w:type="spellEnd"/>
-      <w:r>
-        <w:t xml:space="preserve"> que respondan a eventos de inserción, actualización o eliminación sobre las tablas definidas.</w:t>
+        <w:t>Triggers que respondan a eventos de inserción, actualización o eliminación sobre las tablas definidas.</w:t>
       </w:r>
     </w:p>
     <w:p>
@@ -5760,33 +5326,13 @@
               <w:rPr>
                 <w:bCs/>
               </w:rPr>
-              <w:t xml:space="preserve">Jaiber </w:t>
-            </w:r>
-            <w:proofErr w:type="spellStart"/>
+              <w:t xml:space="preserve">Jaiber Duvan </w:t>
+            </w:r>
             <w:r>
               <w:rPr>
                 <w:bCs/>
               </w:rPr>
-              <w:t>Duvan</w:t>
-            </w:r>
-            <w:proofErr w:type="spellEnd"/>
-            <w:r>
-              <w:rPr>
-                <w:bCs/>
-              </w:rPr>
-              <w:t xml:space="preserve"> </w:t>
-            </w:r>
-            <w:r>
-              <w:rPr>
-                <w:bCs/>
-              </w:rPr>
-              <w:t>Diaz</w:t>
-            </w:r>
-            <w:r>
-              <w:rPr>
-                <w:bCs/>
-              </w:rPr>
-              <w:t xml:space="preserve"> León</w:t>
+              <w:t>Diaz León</w:t>
             </w:r>
             <w:r>
               <w:rPr>
@@ -5867,13 +5413,7 @@
               </w:rPr>
             </w:pPr>
             <w:r>
-              <w:t xml:space="preserve">Tecnología/ </w:t>
-            </w:r>
-            <w:r>
-              <w:t>Gestión</w:t>
-            </w:r>
-            <w:r>
-              <w:t xml:space="preserve"> de Proyectos</w:t>
+              <w:t>Tecnología/ Gestión de Proyectos</w:t>
             </w:r>
           </w:p>
         </w:tc>
@@ -6084,11 +5624,9 @@
             <w:r>
               <w:t xml:space="preserve"> </w:t>
             </w:r>
-            <w:proofErr w:type="spellStart"/>
             <w:r>
               <w:t>BackEnd</w:t>
             </w:r>
-            <w:proofErr w:type="spellEnd"/>
           </w:p>
         </w:tc>
         <w:tc>
@@ -6172,14 +5710,12 @@
               </w:rPr>
               <w:t xml:space="preserve">Desarrollador </w:t>
             </w:r>
-            <w:proofErr w:type="spellStart"/>
             <w:r>
               <w:rPr>
                 <w:color w:val="000000"/>
               </w:rPr>
               <w:t>FrontEnd</w:t>
             </w:r>
-            <w:proofErr w:type="spellEnd"/>
           </w:p>
         </w:tc>
         <w:tc>
@@ -6228,15 +5764,7 @@
               <w:jc w:val="center"/>
             </w:pPr>
             <w:r>
-              <w:t xml:space="preserve">Jaiber </w:t>
-            </w:r>
-            <w:proofErr w:type="spellStart"/>
-            <w:r>
-              <w:t>Duvan</w:t>
-            </w:r>
-            <w:proofErr w:type="spellEnd"/>
-            <w:r>
-              <w:t xml:space="preserve"> Diaz </w:t>
+              <w:t xml:space="preserve">Jaiber Duvan Diaz </w:t>
             </w:r>
             <w:r>
               <w:t>León</w:t>
@@ -6397,6 +5925,9 @@
       </w:rPr>
     </w:pPr>
     <w:r>
+      <w:rPr>
+        <w:noProof/>
+      </w:rPr>
       <mc:AlternateContent>
         <mc:Choice Requires="wps">
           <w:drawing>
@@ -6443,7 +5974,7 @@
             </wp:anchor>
           </w:drawing>
         </mc:Choice>
-        <mc:Fallback xmlns:a="http://schemas.openxmlformats.org/drawingml/2006/main" xmlns:arto="http://schemas.microsoft.com/office/word/2006/arto">
+        <mc:Fallback xmlns:arto="http://schemas.microsoft.com/office/word/2006/arto" xmlns:a="http://schemas.openxmlformats.org/drawingml/2006/main">
           <w:pict w14:anchorId="6243B7EE">
             <v:shapetype id="_x0000_t32" coordsize="21600,21600" o:oned="t" filled="f" o:spt="32" path="m,l21600,21600e" w14:anchorId="1E904BB6">
               <v:path fillok="f" arrowok="t" o:connecttype="none"/>
@@ -6567,6 +6098,9 @@
       </w:rPr>
     </w:pPr>
     <w:r>
+      <w:rPr>
+        <w:noProof/>
+      </w:rPr>
       <mc:AlternateContent>
         <mc:Choice Requires="wps">
           <w:drawing>
@@ -6613,7 +6147,7 @@
             </wp:anchor>
           </w:drawing>
         </mc:Choice>
-        <mc:Fallback xmlns:a="http://schemas.openxmlformats.org/drawingml/2006/main" xmlns:arto="http://schemas.microsoft.com/office/word/2006/arto">
+        <mc:Fallback xmlns:arto="http://schemas.microsoft.com/office/word/2006/arto" xmlns:a="http://schemas.openxmlformats.org/drawingml/2006/main">
           <w:pict w14:anchorId="0249D90B">
             <v:shapetype id="_x0000_t32" coordsize="21600,21600" o:oned="t" filled="f" o:spt="32" path="m,l21600,21600e" w14:anchorId="3D39ABF8">
               <v:path fillok="f" arrowok="t" o:connecttype="none"/>
@@ -6821,6 +6355,7 @@
           <w:r>
             <w:rPr>
               <w:rFonts w:eastAsia="Arial" w:cs="Arial"/>
+              <w:noProof/>
               <w:color w:val="000000"/>
               <w:szCs w:val="24"/>
             </w:rPr>
@@ -7035,6 +6570,9 @@
       </w:rPr>
     </w:pPr>
     <w:r>
+      <w:rPr>
+        <w:noProof/>
+      </w:rPr>
       <mc:AlternateContent>
         <mc:Choice Requires="wps">
           <w:drawing>
@@ -7081,7 +6619,7 @@
             </wp:anchor>
           </w:drawing>
         </mc:Choice>
-        <mc:Fallback xmlns:a="http://schemas.openxmlformats.org/drawingml/2006/main" xmlns:pic="http://schemas.openxmlformats.org/drawingml/2006/picture" xmlns:arto="http://schemas.microsoft.com/office/word/2006/arto">
+        <mc:Fallback xmlns:arto="http://schemas.microsoft.com/office/word/2006/arto" xmlns:pic="http://schemas.openxmlformats.org/drawingml/2006/picture" xmlns:a="http://schemas.openxmlformats.org/drawingml/2006/main">
           <w:pict w14:anchorId="40C35BD2">
             <v:shapetype id="_x0000_t32" coordsize="21600,21600" o:oned="t" filled="f" o:spt="32" path="m,l21600,21600e" w14:anchorId="694556F6">
               <v:path fillok="f" arrowok="t" o:connecttype="none"/>
@@ -7174,6 +6712,7 @@
           <w:r>
             <w:rPr>
               <w:rFonts w:eastAsia="Arial" w:cs="Arial"/>
+              <w:noProof/>
               <w:color w:val="000000"/>
               <w:szCs w:val="24"/>
             </w:rPr>
@@ -7373,6 +6912,9 @@
       </w:rPr>
     </w:pPr>
     <w:r>
+      <w:rPr>
+        <w:noProof/>
+      </w:rPr>
       <mc:AlternateContent>
         <mc:Choice Requires="wps">
           <w:drawing>
@@ -7419,7 +6961,7 @@
             </wp:anchor>
           </w:drawing>
         </mc:Choice>
-        <mc:Fallback xmlns:a="http://schemas.openxmlformats.org/drawingml/2006/main" xmlns:pic="http://schemas.openxmlformats.org/drawingml/2006/picture" xmlns:arto="http://schemas.microsoft.com/office/word/2006/arto">
+        <mc:Fallback xmlns:arto="http://schemas.microsoft.com/office/word/2006/arto" xmlns:pic="http://schemas.openxmlformats.org/drawingml/2006/picture" xmlns:a="http://schemas.openxmlformats.org/drawingml/2006/main">
           <w:pict w14:anchorId="11E660D8">
             <v:shapetype id="_x0000_t32" coordsize="21600,21600" o:oned="t" filled="f" o:spt="32" path="m,l21600,21600e" w14:anchorId="073CB6D9">
               <v:path fillok="f" arrowok="t" o:connecttype="none"/>
@@ -10550,6 +10092,7 @@
   <w:style w:type="character" w:default="1" w:styleId="DefaultParagraphFont">
     <w:name w:val="Default Paragraph Font"/>
     <w:uiPriority w:val="1"/>
+    <w:semiHidden/>
     <w:unhideWhenUsed/>
   </w:style>
   <w:style w:type="table" w:default="1" w:styleId="TableNormal">

</xml_diff>